<commit_message>
docs(silver): update data quality and transformation slides
</commit_message>
<xml_diff>
--- a/[Team 2] - Data Quality & Transformation.docx
+++ b/[Team 2] - Data Quality & Transformation.docx
@@ -363,7 +363,24 @@
                 <w:sz w:val="26"/>
                 <w:szCs w:val="26"/>
               </w:rPr>
-              <w:t>remove duplicates; null → Error_Record</w:t>
+              <w:t>remove duplicates</w:t>
+            </w:r>
+            <w:r>
+              <w:rPr>
+                <w:rFonts w:ascii="Times New Roman" w:hAnsi="Times New Roman" w:cs="Times New Roman"/>
+                <w:sz w:val="26"/>
+                <w:szCs w:val="26"/>
+                <w:lang w:val="vi-VN"/>
+              </w:rPr>
+              <w:t xml:space="preserve"> (cho những record giống nhau hoàn)</w:t>
+            </w:r>
+            <w:r>
+              <w:rPr>
+                <w:rFonts w:ascii="Times New Roman" w:hAnsi="Times New Roman" w:cs="Times New Roman"/>
+                <w:sz w:val="26"/>
+                <w:szCs w:val="26"/>
+              </w:rPr>
+              <w:t>; null → Error_Record</w:t>
             </w:r>
           </w:p>
         </w:tc>
@@ -576,6 +593,7 @@
                 <w:sz w:val="26"/>
                 <w:szCs w:val="26"/>
               </w:rPr>
+              <w:lastRenderedPageBreak/>
               <w:t>dob</w:t>
             </w:r>
           </w:p>
@@ -622,57 +640,30 @@
                 <w:sz w:val="26"/>
                 <w:szCs w:val="26"/>
               </w:rPr>
-              <w:t xml:space="preserve">valid date, </w:t>
-            </w:r>
-            <w:r>
+              <w:t>valid date, format yyyy-MM-dd, &lt; current_date</w:t>
+            </w:r>
+          </w:p>
+        </w:tc>
+        <w:tc>
+          <w:tcPr>
+            <w:tcW w:w="2160" w:type="dxa"/>
+          </w:tcPr>
+          <w:p>
+            <w:pPr>
+              <w:spacing w:line="360" w:lineRule="auto"/>
               <w:rPr>
                 <w:rFonts w:ascii="Times New Roman" w:hAnsi="Times New Roman" w:cs="Times New Roman"/>
                 <w:sz w:val="26"/>
                 <w:szCs w:val="26"/>
               </w:rPr>
-              <w:t xml:space="preserve">format yyyy-MM-dd, &lt; </w:t>
-            </w:r>
+            </w:pPr>
             <w:r>
               <w:rPr>
                 <w:rFonts w:ascii="Times New Roman" w:hAnsi="Times New Roman" w:cs="Times New Roman"/>
                 <w:sz w:val="26"/>
                 <w:szCs w:val="26"/>
               </w:rPr>
-              <w:lastRenderedPageBreak/>
-              <w:t>current_date</w:t>
-            </w:r>
-          </w:p>
-        </w:tc>
-        <w:tc>
-          <w:tcPr>
-            <w:tcW w:w="2160" w:type="dxa"/>
-          </w:tcPr>
-          <w:p>
-            <w:pPr>
-              <w:spacing w:line="360" w:lineRule="auto"/>
-              <w:rPr>
-                <w:rFonts w:ascii="Times New Roman" w:hAnsi="Times New Roman" w:cs="Times New Roman"/>
-                <w:sz w:val="26"/>
-                <w:szCs w:val="26"/>
-              </w:rPr>
-            </w:pPr>
-            <w:r>
-              <w:rPr>
-                <w:rFonts w:ascii="Times New Roman" w:hAnsi="Times New Roman" w:cs="Times New Roman"/>
-                <w:sz w:val="26"/>
-                <w:szCs w:val="26"/>
-              </w:rPr>
-              <w:lastRenderedPageBreak/>
-              <w:t xml:space="preserve">convert to ISO 8601 format; </w:t>
-            </w:r>
-            <w:r>
-              <w:rPr>
-                <w:rFonts w:ascii="Times New Roman" w:hAnsi="Times New Roman" w:cs="Times New Roman"/>
-                <w:sz w:val="26"/>
-                <w:szCs w:val="26"/>
-              </w:rPr>
-              <w:lastRenderedPageBreak/>
-              <w:t>invalid → Error_Record</w:t>
+              <w:t>convert to ISO 8601 format; invalid → Error_Record</w:t>
             </w:r>
           </w:p>
         </w:tc>
@@ -697,7 +688,6 @@
                 <w:sz w:val="26"/>
                 <w:szCs w:val="26"/>
               </w:rPr>
-              <w:lastRenderedPageBreak/>
               <w:t>phone_number</w:t>
             </w:r>
           </w:p>
@@ -936,6 +926,15 @@
               </w:rPr>
               <w:t>Not null</w:t>
             </w:r>
+            <w:r>
+              <w:rPr>
+                <w:rFonts w:ascii="Times New Roman" w:hAnsi="Times New Roman" w:cs="Times New Roman"/>
+                <w:sz w:val="26"/>
+                <w:szCs w:val="26"/>
+                <w:lang w:val="vi-VN"/>
+              </w:rPr>
+              <w:t xml:space="preserve"> </w:t>
+            </w:r>
           </w:p>
         </w:tc>
         <w:tc>
@@ -1018,6 +1017,7 @@
               <w:spacing w:line="360" w:lineRule="auto"/>
               <w:rPr>
                 <w:rFonts w:ascii="Times New Roman" w:hAnsi="Times New Roman" w:cs="Times New Roman"/>
+                <w:color w:val="FF0000"/>
                 <w:sz w:val="26"/>
                 <w:szCs w:val="26"/>
                 <w:lang w:val="vi-VN"/>
@@ -1039,6 +1039,25 @@
                 <w:lang w:val="vi-VN"/>
               </w:rPr>
               <w:t xml:space="preserve"> null</w:t>
+            </w:r>
+            <w:r>
+              <w:rPr>
+                <w:rFonts w:ascii="Times New Roman" w:hAnsi="Times New Roman" w:cs="Times New Roman"/>
+                <w:sz w:val="26"/>
+                <w:szCs w:val="26"/>
+                <w:lang w:val="vi-VN"/>
+              </w:rPr>
+              <w:t xml:space="preserve"> </w:t>
+            </w:r>
+            <w:r>
+              <w:rPr>
+                <w:rFonts w:ascii="Times New Roman" w:hAnsi="Times New Roman" w:cs="Times New Roman"/>
+                <w:color w:val="FF0000"/>
+                <w:sz w:val="26"/>
+                <w:szCs w:val="26"/>
+                <w:lang w:val="vi-VN"/>
+              </w:rPr>
+              <w:t>(đối chiếu lại dữ liệu)</w:t>
             </w:r>
           </w:p>
         </w:tc>
@@ -1313,9 +1332,17 @@
                 <w:sz w:val="26"/>
                 <w:szCs w:val="26"/>
               </w:rPr>
-              <w:t>Co</w:t>
-            </w:r>
-            <w:r>
+              <w:t>Column</w:t>
+            </w:r>
+          </w:p>
+        </w:tc>
+        <w:tc>
+          <w:tcPr>
+            <w:tcW w:w="2160" w:type="dxa"/>
+          </w:tcPr>
+          <w:p>
+            <w:pPr>
+              <w:spacing w:line="360" w:lineRule="auto"/>
               <w:rPr>
                 <w:rFonts w:ascii="Times New Roman" w:hAnsi="Times New Roman" w:cs="Times New Roman"/>
                 <w:b/>
@@ -1323,17 +1350,8 @@
                 <w:sz w:val="26"/>
                 <w:szCs w:val="26"/>
               </w:rPr>
-              <w:t>lumn</w:t>
-            </w:r>
-          </w:p>
-        </w:tc>
-        <w:tc>
-          <w:tcPr>
-            <w:tcW w:w="2160" w:type="dxa"/>
-          </w:tcPr>
-          <w:p>
-            <w:pPr>
-              <w:spacing w:line="360" w:lineRule="auto"/>
+            </w:pPr>
+            <w:r>
               <w:rPr>
                 <w:rFonts w:ascii="Times New Roman" w:hAnsi="Times New Roman" w:cs="Times New Roman"/>
                 <w:b/>
@@ -1341,8 +1359,17 @@
                 <w:sz w:val="26"/>
                 <w:szCs w:val="26"/>
               </w:rPr>
-            </w:pPr>
-            <w:r>
+              <w:t>Data Type</w:t>
+            </w:r>
+          </w:p>
+        </w:tc>
+        <w:tc>
+          <w:tcPr>
+            <w:tcW w:w="2160" w:type="dxa"/>
+          </w:tcPr>
+          <w:p>
+            <w:pPr>
+              <w:spacing w:line="360" w:lineRule="auto"/>
               <w:rPr>
                 <w:rFonts w:ascii="Times New Roman" w:hAnsi="Times New Roman" w:cs="Times New Roman"/>
                 <w:b/>
@@ -1350,17 +1377,8 @@
                 <w:sz w:val="26"/>
                 <w:szCs w:val="26"/>
               </w:rPr>
-              <w:t>Data Type</w:t>
-            </w:r>
-          </w:p>
-        </w:tc>
-        <w:tc>
-          <w:tcPr>
-            <w:tcW w:w="2160" w:type="dxa"/>
-          </w:tcPr>
-          <w:p>
-            <w:pPr>
-              <w:spacing w:line="360" w:lineRule="auto"/>
+            </w:pPr>
+            <w:r>
               <w:rPr>
                 <w:rFonts w:ascii="Times New Roman" w:hAnsi="Times New Roman" w:cs="Times New Roman"/>
                 <w:b/>
@@ -1368,8 +1386,17 @@
                 <w:sz w:val="26"/>
                 <w:szCs w:val="26"/>
               </w:rPr>
-            </w:pPr>
-            <w:r>
+              <w:t>Validation Rule</w:t>
+            </w:r>
+          </w:p>
+        </w:tc>
+        <w:tc>
+          <w:tcPr>
+            <w:tcW w:w="2160" w:type="dxa"/>
+          </w:tcPr>
+          <w:p>
+            <w:pPr>
+              <w:spacing w:line="360" w:lineRule="auto"/>
               <w:rPr>
                 <w:rFonts w:ascii="Times New Roman" w:hAnsi="Times New Roman" w:cs="Times New Roman"/>
                 <w:b/>
@@ -1377,17 +1404,8 @@
                 <w:sz w:val="26"/>
                 <w:szCs w:val="26"/>
               </w:rPr>
-              <w:t>Validation Rule</w:t>
-            </w:r>
-          </w:p>
-        </w:tc>
-        <w:tc>
-          <w:tcPr>
-            <w:tcW w:w="2160" w:type="dxa"/>
-          </w:tcPr>
-          <w:p>
-            <w:pPr>
-              <w:spacing w:line="360" w:lineRule="auto"/>
+            </w:pPr>
+            <w:r>
               <w:rPr>
                 <w:rFonts w:ascii="Times New Roman" w:hAnsi="Times New Roman" w:cs="Times New Roman"/>
                 <w:b/>
@@ -1395,15 +1413,6 @@
                 <w:sz w:val="26"/>
                 <w:szCs w:val="26"/>
               </w:rPr>
-            </w:pPr>
-            <w:r>
-              <w:rPr>
-                <w:rFonts w:ascii="Times New Roman" w:hAnsi="Times New Roman" w:cs="Times New Roman"/>
-                <w:b/>
-                <w:bCs/>
-                <w:sz w:val="26"/>
-                <w:szCs w:val="26"/>
-              </w:rPr>
               <w:t>Cleansing Action</w:t>
             </w:r>
           </w:p>
@@ -1523,6 +1532,7 @@
                 <w:sz w:val="26"/>
                 <w:szCs w:val="26"/>
               </w:rPr>
+              <w:lastRenderedPageBreak/>
               <w:t>customer_id</w:t>
             </w:r>
           </w:p>
@@ -1559,8 +1569,10 @@
               <w:spacing w:line="360" w:lineRule="auto"/>
               <w:rPr>
                 <w:rFonts w:ascii="Times New Roman" w:hAnsi="Times New Roman" w:cs="Times New Roman"/>
-                <w:sz w:val="26"/>
-                <w:szCs w:val="26"/>
+                <w:color w:val="FF0000"/>
+                <w:sz w:val="26"/>
+                <w:szCs w:val="26"/>
+                <w:lang w:val="vi-VN"/>
               </w:rPr>
             </w:pPr>
             <w:r>
@@ -1570,6 +1582,25 @@
                 <w:szCs w:val="26"/>
               </w:rPr>
               <w:t>not null, valid FK</w:t>
+            </w:r>
+            <w:r>
+              <w:rPr>
+                <w:rFonts w:ascii="Times New Roman" w:hAnsi="Times New Roman" w:cs="Times New Roman"/>
+                <w:sz w:val="26"/>
+                <w:szCs w:val="26"/>
+                <w:lang w:val="vi-VN"/>
+              </w:rPr>
+              <w:t xml:space="preserve"> </w:t>
+            </w:r>
+            <w:r>
+              <w:rPr>
+                <w:rFonts w:ascii="Times New Roman" w:hAnsi="Times New Roman" w:cs="Times New Roman"/>
+                <w:color w:val="FF0000"/>
+                <w:sz w:val="26"/>
+                <w:szCs w:val="26"/>
+                <w:lang w:val="vi-VN"/>
+              </w:rPr>
+              <w:t>(check lại business rule xem có thể null hay không)</w:t>
             </w:r>
           </w:p>
         </w:tc>
@@ -1686,16 +1717,7 @@
                 <w:sz w:val="26"/>
                 <w:szCs w:val="26"/>
               </w:rPr>
-              <w:t xml:space="preserve">uppercase </w:t>
-            </w:r>
-            <w:r>
-              <w:rPr>
-                <w:rFonts w:ascii="Times New Roman" w:hAnsi="Times New Roman" w:cs="Times New Roman"/>
-                <w:sz w:val="26"/>
-                <w:szCs w:val="26"/>
-              </w:rPr>
-              <w:lastRenderedPageBreak/>
-              <w:t>standardization; invalid/null → Error_Record</w:t>
+              <w:t>uppercase standardization; invalid/null → Error_Record</w:t>
             </w:r>
           </w:p>
         </w:tc>
@@ -1720,7 +1742,6 @@
                 <w:sz w:val="26"/>
                 <w:szCs w:val="26"/>
               </w:rPr>
-              <w:lastRenderedPageBreak/>
               <w:t>vehicle_brand</w:t>
             </w:r>
           </w:p>
@@ -2606,6 +2627,7 @@
                 <w:szCs w:val="26"/>
                 <w:lang w:val="vi-VN" w:eastAsia="vi-VN"/>
               </w:rPr>
+              <w:lastRenderedPageBreak/>
               <w:t>agent_name</w:t>
             </w:r>
           </w:p>
@@ -3089,7 +3111,6 @@
                 <w:szCs w:val="26"/>
                 <w:lang w:val="vi-VN" w:eastAsia="vi-VN"/>
               </w:rPr>
-              <w:lastRenderedPageBreak/>
               <w:t>manager_name</w:t>
             </w:r>
           </w:p>
@@ -3409,9 +3430,9 @@
       </w:tblPr>
       <w:tblGrid>
         <w:gridCol w:w="1708"/>
-        <w:gridCol w:w="1147"/>
-        <w:gridCol w:w="1697"/>
-        <w:gridCol w:w="4072"/>
+        <w:gridCol w:w="1333"/>
+        <w:gridCol w:w="1619"/>
+        <w:gridCol w:w="3964"/>
       </w:tblGrid>
       <w:tr>
         <w:trPr>
@@ -4151,7 +4172,7 @@
                 <w:szCs w:val="26"/>
                 <w:lang w:val="vi-VN" w:eastAsia="vi-VN"/>
               </w:rPr>
-              <w:t>STRING</w:t>
+              <w:t>BOOLEAN</w:t>
             </w:r>
           </w:p>
         </w:tc>
@@ -4178,19 +4199,47 @@
               <w:spacing w:after="0" w:line="360" w:lineRule="auto"/>
               <w:rPr>
                 <w:rFonts w:ascii="Times New Roman" w:eastAsia="Times New Roman" w:hAnsi="Times New Roman" w:cs="Times New Roman"/>
-                <w:sz w:val="26"/>
-                <w:szCs w:val="26"/>
-                <w:lang w:val="vi-VN" w:eastAsia="vi-VN"/>
-              </w:rPr>
-            </w:pPr>
-            <w:r>
-              <w:rPr>
-                <w:rFonts w:ascii="Times New Roman" w:eastAsia="Times New Roman" w:hAnsi="Times New Roman" w:cs="Times New Roman"/>
-                <w:sz w:val="26"/>
-                <w:szCs w:val="26"/>
-                <w:lang w:val="vi-VN" w:eastAsia="vi-VN"/>
-              </w:rPr>
-              <w:t>valid values (Y, N)</w:t>
+                <w:color w:val="FF0000"/>
+                <w:sz w:val="26"/>
+                <w:szCs w:val="26"/>
+                <w:lang w:val="vi-VN" w:eastAsia="vi-VN"/>
+              </w:rPr>
+            </w:pPr>
+            <w:r>
+              <w:rPr>
+                <w:rFonts w:ascii="Times New Roman" w:eastAsia="Times New Roman" w:hAnsi="Times New Roman" w:cs="Times New Roman"/>
+                <w:sz w:val="26"/>
+                <w:szCs w:val="26"/>
+                <w:lang w:val="vi-VN" w:eastAsia="vi-VN"/>
+              </w:rPr>
+              <w:t>valid values (</w:t>
+            </w:r>
+            <w:r>
+              <w:rPr>
+                <w:rFonts w:ascii="Times New Roman" w:eastAsia="Times New Roman" w:hAnsi="Times New Roman" w:cs="Times New Roman"/>
+                <w:sz w:val="26"/>
+                <w:szCs w:val="26"/>
+                <w:lang w:val="vi-VN" w:eastAsia="vi-VN"/>
+              </w:rPr>
+              <w:t>0, 1</w:t>
+            </w:r>
+            <w:r>
+              <w:rPr>
+                <w:rFonts w:ascii="Times New Roman" w:eastAsia="Times New Roman" w:hAnsi="Times New Roman" w:cs="Times New Roman"/>
+                <w:sz w:val="26"/>
+                <w:szCs w:val="26"/>
+                <w:lang w:val="vi-VN" w:eastAsia="vi-VN"/>
+              </w:rPr>
+              <w:t>)</w:t>
+            </w:r>
+            <w:r>
+              <w:rPr>
+                <w:rFonts w:ascii="Times New Roman" w:eastAsia="Times New Roman" w:hAnsi="Times New Roman" w:cs="Times New Roman"/>
+                <w:sz w:val="26"/>
+                <w:szCs w:val="26"/>
+                <w:lang w:val="vi-VN" w:eastAsia="vi-VN"/>
+              </w:rPr>
+              <w:t xml:space="preserve"> </w:t>
             </w:r>
           </w:p>
         </w:tc>
@@ -4637,6 +4686,7 @@
                 <w:szCs w:val="26"/>
                 <w:lang w:val="vi-VN" w:eastAsia="vi-VN"/>
               </w:rPr>
+              <w:lastRenderedPageBreak/>
               <w:t>customer_id</w:t>
             </w:r>
           </w:p>
@@ -4864,6 +4914,7 @@
               <w:spacing w:after="0" w:line="360" w:lineRule="auto"/>
               <w:rPr>
                 <w:rFonts w:ascii="Times New Roman" w:eastAsia="Times New Roman" w:hAnsi="Times New Roman" w:cs="Times New Roman"/>
+                <w:color w:val="FF0000"/>
                 <w:sz w:val="26"/>
                 <w:szCs w:val="26"/>
                 <w:lang w:val="vi-VN" w:eastAsia="vi-VN"/>
@@ -4877,6 +4928,25 @@
                 <w:lang w:val="vi-VN" w:eastAsia="vi-VN"/>
               </w:rPr>
               <w:t>nullable, valid FK</w:t>
+            </w:r>
+            <w:r>
+              <w:rPr>
+                <w:rFonts w:ascii="Times New Roman" w:eastAsia="Times New Roman" w:hAnsi="Times New Roman" w:cs="Times New Roman"/>
+                <w:sz w:val="26"/>
+                <w:szCs w:val="26"/>
+                <w:lang w:val="vi-VN" w:eastAsia="vi-VN"/>
+              </w:rPr>
+              <w:t xml:space="preserve"> </w:t>
+            </w:r>
+            <w:r>
+              <w:rPr>
+                <w:rFonts w:ascii="Times New Roman" w:eastAsia="Times New Roman" w:hAnsi="Times New Roman" w:cs="Times New Roman"/>
+                <w:color w:val="FF0000"/>
+                <w:sz w:val="26"/>
+                <w:szCs w:val="26"/>
+                <w:lang w:val="vi-VN" w:eastAsia="vi-VN"/>
+              </w:rPr>
+              <w:t>(Check lại business rule)</w:t>
             </w:r>
           </w:p>
         </w:tc>
@@ -5120,7 +5190,6 @@
                 <w:szCs w:val="26"/>
                 <w:lang w:val="vi-VN" w:eastAsia="vi-VN"/>
               </w:rPr>
-              <w:lastRenderedPageBreak/>
               <w:t>quotation_date</w:t>
             </w:r>
           </w:p>
@@ -5882,7 +5951,17 @@
                 <w:szCs w:val="26"/>
                 <w:lang w:val="vi-VN" w:eastAsia="vi-VN"/>
               </w:rPr>
-              <w:t>convert to ISO 8601 format; invalid → Error_Record</w:t>
+              <w:t xml:space="preserve">convert to ISO 8601 format; </w:t>
+            </w:r>
+            <w:r>
+              <w:rPr>
+                <w:rFonts w:ascii="Times New Roman" w:eastAsia="Times New Roman" w:hAnsi="Times New Roman" w:cs="Times New Roman"/>
+                <w:sz w:val="26"/>
+                <w:szCs w:val="26"/>
+                <w:lang w:val="vi-VN" w:eastAsia="vi-VN"/>
+              </w:rPr>
+              <w:lastRenderedPageBreak/>
+              <w:t>invalid → Error_Record</w:t>
             </w:r>
           </w:p>
         </w:tc>
@@ -6406,17 +6485,7 @@
                 <w:szCs w:val="26"/>
                 <w:lang w:val="vi-VN" w:eastAsia="vi-VN"/>
               </w:rPr>
-              <w:t xml:space="preserve">invalid FK/null → </w:t>
-            </w:r>
-            <w:r>
-              <w:rPr>
-                <w:rFonts w:ascii="Times New Roman" w:eastAsia="Times New Roman" w:hAnsi="Times New Roman" w:cs="Times New Roman"/>
-                <w:sz w:val="26"/>
-                <w:szCs w:val="26"/>
-                <w:lang w:val="vi-VN" w:eastAsia="vi-VN"/>
-              </w:rPr>
-              <w:lastRenderedPageBreak/>
-              <w:t>Error_Record</w:t>
+              <w:t>invalid FK/null → Error_Record</w:t>
             </w:r>
           </w:p>
         </w:tc>
@@ -6460,7 +6529,6 @@
                 <w:szCs w:val="26"/>
                 <w:lang w:val="vi-VN" w:eastAsia="vi-VN"/>
               </w:rPr>
-              <w:lastRenderedPageBreak/>
               <w:t>coverage_type</w:t>
             </w:r>
           </w:p>
@@ -7319,6 +7387,7 @@
                 <w:szCs w:val="26"/>
                 <w:lang w:val="vi-VN" w:eastAsia="vi-VN"/>
               </w:rPr>
+              <w:lastRenderedPageBreak/>
               <w:t>quotation_id</w:t>
             </w:r>
           </w:p>
@@ -7719,7 +7788,16 @@
                 <w:szCs w:val="26"/>
                 <w:lang w:val="vi-VN" w:eastAsia="vi-VN"/>
               </w:rPr>
-              <w:t>not null, valid reference</w:t>
+              <w:t xml:space="preserve">not null, valid </w:t>
+            </w:r>
+            <w:r>
+              <w:rPr>
+                <w:rFonts w:ascii="Times New Roman" w:eastAsia="Times New Roman" w:hAnsi="Times New Roman" w:cs="Times New Roman"/>
+                <w:sz w:val="26"/>
+                <w:szCs w:val="26"/>
+                <w:lang w:val="vi-VN" w:eastAsia="vi-VN"/>
+              </w:rPr>
+              <w:t xml:space="preserve"> FK</w:t>
             </w:r>
           </w:p>
         </w:tc>
@@ -8041,17 +8119,7 @@
                 <w:szCs w:val="26"/>
                 <w:lang w:val="vi-VN" w:eastAsia="vi-VN"/>
               </w:rPr>
-              <w:t xml:space="preserve">not null, valid </w:t>
-            </w:r>
-            <w:r>
-              <w:rPr>
-                <w:rFonts w:ascii="Times New Roman" w:eastAsia="Times New Roman" w:hAnsi="Times New Roman" w:cs="Times New Roman"/>
-                <w:sz w:val="26"/>
-                <w:szCs w:val="26"/>
-                <w:lang w:val="vi-VN" w:eastAsia="vi-VN"/>
-              </w:rPr>
-              <w:lastRenderedPageBreak/>
-              <w:t>date, &lt;= end_date</w:t>
+              <w:t>not null, valid date, &lt;= end_date</w:t>
             </w:r>
           </w:p>
         </w:tc>
@@ -8090,18 +8158,7 @@
                 <w:szCs w:val="26"/>
                 <w:lang w:val="vi-VN" w:eastAsia="vi-VN"/>
               </w:rPr>
-              <w:lastRenderedPageBreak/>
-              <w:t xml:space="preserve">ISO 8601 format; </w:t>
-            </w:r>
-            <w:r>
-              <w:rPr>
-                <w:rFonts w:ascii="Times New Roman" w:eastAsia="Times New Roman" w:hAnsi="Times New Roman" w:cs="Times New Roman"/>
-                <w:sz w:val="26"/>
-                <w:szCs w:val="26"/>
-                <w:lang w:val="vi-VN" w:eastAsia="vi-VN"/>
-              </w:rPr>
-              <w:lastRenderedPageBreak/>
-              <w:t>invalid/null → Error_Record</w:t>
+              <w:t>ISO 8601 format; invalid/null → Error_Record</w:t>
             </w:r>
           </w:p>
         </w:tc>
@@ -8145,7 +8202,6 @@
                 <w:szCs w:val="26"/>
                 <w:lang w:val="vi-VN" w:eastAsia="vi-VN"/>
               </w:rPr>
-              <w:lastRenderedPageBreak/>
               <w:t>policy_end_date</w:t>
             </w:r>
           </w:p>
@@ -8804,8 +8860,8 @@
       <w:tblGrid>
         <w:gridCol w:w="2155"/>
         <w:gridCol w:w="1903"/>
-        <w:gridCol w:w="2251"/>
-        <w:gridCol w:w="2315"/>
+        <w:gridCol w:w="2378"/>
+        <w:gridCol w:w="2188"/>
       </w:tblGrid>
       <w:tr>
         <w:trPr>
@@ -8963,7 +9019,25 @@
                 <w:szCs w:val="26"/>
                 <w:lang w:val="vi-VN" w:eastAsia="vi-VN"/>
               </w:rPr>
-              <w:t>Cleansing Action</w:t>
+              <w:t xml:space="preserve">Cleansing </w:t>
+            </w:r>
+            <w:r>
+              <w:rPr>
+                <w:rFonts w:ascii="Times New Roman" w:eastAsia="Times New Roman" w:hAnsi="Times New Roman" w:cs="Times New Roman"/>
+                <w:sz w:val="26"/>
+                <w:szCs w:val="26"/>
+                <w:lang w:val="vi-VN" w:eastAsia="vi-VN"/>
+              </w:rPr>
+              <w:t>A</w:t>
+            </w:r>
+            <w:r>
+              <w:rPr>
+                <w:rFonts w:ascii="Times New Roman" w:eastAsia="Times New Roman" w:hAnsi="Times New Roman" w:cs="Times New Roman"/>
+                <w:sz w:val="26"/>
+                <w:szCs w:val="26"/>
+                <w:lang w:val="vi-VN" w:eastAsia="vi-VN"/>
+              </w:rPr>
+              <w:t>ction</w:t>
             </w:r>
           </w:p>
         </w:tc>
@@ -9007,6 +9081,7 @@
                 <w:szCs w:val="26"/>
                 <w:lang w:val="vi-VN" w:eastAsia="vi-VN"/>
               </w:rPr>
+              <w:lastRenderedPageBreak/>
               <w:t>cancellation_id</w:t>
             </w:r>
           </w:p>
@@ -9568,7 +9643,7 @@
                 <w:szCs w:val="26"/>
                 <w:lang w:val="vi-VN" w:eastAsia="vi-VN"/>
               </w:rPr>
-              <w:t>not null, allowed values</w:t>
+              <w:t>Allow null</w:t>
             </w:r>
           </w:p>
         </w:tc>
@@ -9607,17 +9682,7 @@
                 <w:szCs w:val="26"/>
                 <w:lang w:val="vi-VN" w:eastAsia="vi-VN"/>
               </w:rPr>
-              <w:t xml:space="preserve">uppercase standardization; null/invalid → </w:t>
-            </w:r>
-            <w:r>
-              <w:rPr>
-                <w:rFonts w:ascii="Times New Roman" w:eastAsia="Times New Roman" w:hAnsi="Times New Roman" w:cs="Times New Roman"/>
-                <w:sz w:val="26"/>
-                <w:szCs w:val="26"/>
-                <w:lang w:val="vi-VN" w:eastAsia="vi-VN"/>
-              </w:rPr>
-              <w:lastRenderedPageBreak/>
-              <w:t>Error_Record</w:t>
+              <w:t>uppercase standardization; null/invalid → Error_Record</w:t>
             </w:r>
           </w:p>
         </w:tc>
@@ -9661,7 +9726,6 @@
                 <w:szCs w:val="26"/>
                 <w:lang w:val="vi-VN" w:eastAsia="vi-VN"/>
               </w:rPr>
-              <w:lastRenderedPageBreak/>
               <w:t>refund_amount</w:t>
             </w:r>
           </w:p>
@@ -9728,6 +9792,7 @@
               <w:spacing w:after="0" w:line="360" w:lineRule="auto"/>
               <w:rPr>
                 <w:rFonts w:ascii="Times New Roman" w:eastAsia="Times New Roman" w:hAnsi="Times New Roman" w:cs="Times New Roman"/>
+                <w:color w:val="FF0000"/>
                 <w:sz w:val="26"/>
                 <w:szCs w:val="26"/>
                 <w:lang w:val="vi-VN" w:eastAsia="vi-VN"/>
@@ -9741,6 +9806,25 @@
                 <w:lang w:val="vi-VN" w:eastAsia="vi-VN"/>
               </w:rPr>
               <w:t>&gt;= 0, numeric, &lt;= premium_amount</w:t>
+            </w:r>
+            <w:r>
+              <w:rPr>
+                <w:rFonts w:ascii="Times New Roman" w:eastAsia="Times New Roman" w:hAnsi="Times New Roman" w:cs="Times New Roman"/>
+                <w:sz w:val="26"/>
+                <w:szCs w:val="26"/>
+                <w:lang w:val="vi-VN" w:eastAsia="vi-VN"/>
+              </w:rPr>
+              <w:t xml:space="preserve"> </w:t>
+            </w:r>
+            <w:r>
+              <w:rPr>
+                <w:rFonts w:ascii="Times New Roman" w:eastAsia="Times New Roman" w:hAnsi="Times New Roman" w:cs="Times New Roman"/>
+                <w:color w:val="FF0000"/>
+                <w:sz w:val="26"/>
+                <w:szCs w:val="26"/>
+                <w:lang w:val="vi-VN" w:eastAsia="vi-VN"/>
+              </w:rPr>
+              <w:t>(check business rules)</w:t>
             </w:r>
           </w:p>
         </w:tc>
@@ -9823,8 +9907,8 @@
       <w:tblGrid>
         <w:gridCol w:w="2328"/>
         <w:gridCol w:w="1903"/>
-        <w:gridCol w:w="1760"/>
-        <w:gridCol w:w="2633"/>
+        <w:gridCol w:w="1804"/>
+        <w:gridCol w:w="2589"/>
       </w:tblGrid>
       <w:tr>
         <w:trPr>
@@ -10348,6 +10432,7 @@
                 <w:szCs w:val="26"/>
                 <w:lang w:val="vi-VN" w:eastAsia="vi-VN"/>
               </w:rPr>
+              <w:lastRenderedPageBreak/>
               <w:t>payment_date</w:t>
             </w:r>
           </w:p>
@@ -10992,7 +11077,6 @@
                 <w:szCs w:val="26"/>
                 <w:lang w:val="vi-VN" w:eastAsia="vi-VN"/>
               </w:rPr>
-              <w:lastRenderedPageBreak/>
               <w:t>transaction_reference</w:t>
             </w:r>
           </w:p>
@@ -11059,6 +11143,7 @@
               <w:spacing w:after="0" w:line="360" w:lineRule="auto"/>
               <w:rPr>
                 <w:rFonts w:ascii="Times New Roman" w:eastAsia="Times New Roman" w:hAnsi="Times New Roman" w:cs="Times New Roman"/>
+                <w:color w:val="FF0000"/>
                 <w:sz w:val="26"/>
                 <w:szCs w:val="26"/>
                 <w:lang w:val="vi-VN" w:eastAsia="vi-VN"/>
@@ -11072,6 +11157,25 @@
                 <w:lang w:val="vi-VN" w:eastAsia="vi-VN"/>
               </w:rPr>
               <w:t>not null, unique, pattern match</w:t>
+            </w:r>
+            <w:r>
+              <w:rPr>
+                <w:rFonts w:ascii="Times New Roman" w:eastAsia="Times New Roman" w:hAnsi="Times New Roman" w:cs="Times New Roman"/>
+                <w:sz w:val="26"/>
+                <w:szCs w:val="26"/>
+                <w:lang w:val="vi-VN" w:eastAsia="vi-VN"/>
+              </w:rPr>
+              <w:t xml:space="preserve"> </w:t>
+            </w:r>
+            <w:r>
+              <w:rPr>
+                <w:rFonts w:ascii="Times New Roman" w:eastAsia="Times New Roman" w:hAnsi="Times New Roman" w:cs="Times New Roman"/>
+                <w:color w:val="FF0000"/>
+                <w:sz w:val="26"/>
+                <w:szCs w:val="26"/>
+                <w:lang w:val="vi-VN" w:eastAsia="vi-VN"/>
+              </w:rPr>
+              <w:t>(???)</w:t>
             </w:r>
           </w:p>
         </w:tc>
@@ -11139,13 +11243,7 @@
         <w:rPr>
           <w:rFonts w:cs="Times New Roman"/>
         </w:rPr>
-        <w:t>S</w:t>
-      </w:r>
-      <w:r>
-        <w:rPr>
-          <w:rFonts w:cs="Times New Roman"/>
-        </w:rPr>
-        <w:t>tandard Date &amp; Timestamp Format</w:t>
+        <w:t>Standard Date &amp; Timestamp Format</w:t>
       </w:r>
     </w:p>
     <w:tbl>
@@ -11891,11 +11989,6 @@
     <w:lsdException w:name="Book Title" w:uiPriority="33" w:qFormat="1"/>
     <w:lsdException w:name="Bibliography" w:semiHidden="1" w:uiPriority="37" w:unhideWhenUsed="1"/>
     <w:lsdException w:name="TOC Heading" w:semiHidden="1" w:uiPriority="39" w:unhideWhenUsed="1" w:qFormat="1"/>
-    <w:lsdException w:name="Plain Table 5" w:semiHidden="1" w:unhideWhenUsed="1"/>
-    <w:lsdException w:name="Grid Table Light" w:semiHidden="1" w:unhideWhenUsed="1"/>
-    <w:lsdException w:name="Grid Table 1 Light" w:semiHidden="1" w:unhideWhenUsed="1"/>
-    <w:lsdException w:name="Grid Table 2" w:semiHidden="1" w:unhideWhenUsed="1"/>
-    <w:lsdException w:name="Grid Table 3" w:semiHidden="1" w:unhideWhenUsed="1"/>
     <w:lsdException w:name="Grid Table 4" w:uiPriority="49"/>
     <w:lsdException w:name="Grid Table 5 Dark" w:uiPriority="50"/>
     <w:lsdException w:name="Grid Table 6 Colorful" w:uiPriority="51"/>

</xml_diff>